<commit_message>
Remove .DS_Store and update files
</commit_message>
<xml_diff>
--- a/assets/cv/Zainab_Taha_CV.docx
+++ b/assets/cv/Zainab_Taha_CV.docx
@@ -736,6 +736,18 @@
           <w:color w:val="000000" w:themeColor="text1"/>
         </w:rPr>
       </w:pPr>
+      <w:r>
+        <w:rPr>
+          <w:rFonts w:ascii="Aptos Display" w:hAnsi="Aptos Display"/>
+          <w:b/>
+          <w:bCs/>
+          <w:color w:val="000000" w:themeColor="text1"/>
+          <w:spacing w:val="20"/>
+          <w:sz w:val="21"/>
+          <w:szCs w:val="21"/>
+        </w:rPr>
+        <w:t xml:space="preserve">FEATURED </w:t>
+      </w:r>
       <w:r>
         <w:rPr>
           <w:rFonts w:ascii="Aptos Display" w:hAnsi="Aptos Display"/>

</xml_diff>

<commit_message>
Update status to seeking a cybersecurity internship
</commit_message>
<xml_diff>
--- a/assets/cv/Zainab_Taha_CV.docx
+++ b/assets/cv/Zainab_Taha_CV.docx
@@ -201,21 +201,7 @@
             <w:rFonts w:ascii="Aptos Display" w:hAnsi="Aptos Display"/>
             <w:color w:val="000000" w:themeColor="text1"/>
           </w:rPr>
-          <w:t>gi</w:t>
-        </w:r>
-        <w:r>
-          <w:rPr>
-            <w:rFonts w:ascii="Aptos Display" w:hAnsi="Aptos Display"/>
-            <w:color w:val="000000" w:themeColor="text1"/>
-          </w:rPr>
-          <w:t>t</w:t>
-        </w:r>
-        <w:r>
-          <w:rPr>
-            <w:rFonts w:ascii="Aptos Display" w:hAnsi="Aptos Display"/>
-            <w:color w:val="000000" w:themeColor="text1"/>
-          </w:rPr>
-          <w:t>hub.com/zainabthaa</w:t>
+          <w:t>github.com/zainabthaa</w:t>
         </w:r>
       </w:hyperlink>
       <w:r>
@@ -342,7 +328,21 @@
           <w:rFonts w:ascii="Aptos Display" w:hAnsi="Aptos Display"/>
           <w:color w:val="000000" w:themeColor="text1"/>
         </w:rPr>
-        <w:t xml:space="preserve"> Python, Docker, Terraform, CI/CD, and map technical controls to MITRE ATT&amp;CK, NIST CSF, ISO 27001, NCA ECC</w:t>
+        <w:t xml:space="preserve"> Python, Docker, Terraform, CI/CD, and map</w:t>
+      </w:r>
+      <w:r>
+        <w:rPr>
+          <w:rFonts w:ascii="Aptos Display" w:hAnsi="Aptos Display"/>
+          <w:color w:val="000000" w:themeColor="text1"/>
+        </w:rPr>
+        <w:t>ped</w:t>
+      </w:r>
+      <w:r>
+        <w:rPr>
+          <w:rFonts w:ascii="Aptos Display" w:hAnsi="Aptos Display"/>
+          <w:color w:val="000000" w:themeColor="text1"/>
+        </w:rPr>
+        <w:t xml:space="preserve"> technical controls to MITRE ATT&amp;CK, NIST CSF, ISO 27001, NCA ECC</w:t>
       </w:r>
       <w:r>
         <w:rPr>
@@ -634,7 +634,19 @@
         <w:rPr>
           <w:rFonts w:ascii="Aptos Display" w:hAnsi="Aptos Display"/>
         </w:rPr>
-        <w:t>academic achievement by maintaining a GPA of 3.9</w:t>
+        <w:t>Awarded for</w:t>
+      </w:r>
+      <w:r>
+        <w:rPr>
+          <w:rFonts w:ascii="Aptos Display" w:hAnsi="Aptos Display"/>
+        </w:rPr>
+        <w:t xml:space="preserve"> </w:t>
+      </w:r>
+      <w:r>
+        <w:rPr>
+          <w:rFonts w:ascii="Aptos Display" w:hAnsi="Aptos Display"/>
+        </w:rPr>
+        <w:t>maintaining a GPA of 3.9</w:t>
       </w:r>
       <w:r>
         <w:rPr>
@@ -695,7 +707,13 @@
         <w:rPr>
           <w:rFonts w:ascii="Aptos Display" w:hAnsi="Aptos Display"/>
         </w:rPr>
-        <w:t xml:space="preserve">academic achievement by maintaining a GPA of 3.75 </w:t>
+        <w:t>Awarded for</w:t>
+      </w:r>
+      <w:r>
+        <w:rPr>
+          <w:rFonts w:ascii="Aptos Display" w:hAnsi="Aptos Display"/>
+        </w:rPr>
+        <w:t xml:space="preserve"> maintaining a GPA of 3.75 </w:t>
       </w:r>
       <w:r>
         <w:rPr>
@@ -1511,16 +1529,7 @@
           <w:bCs/>
           <w:color w:val="000000" w:themeColor="text1"/>
         </w:rPr>
-        <w:t>lan</w:t>
-      </w:r>
-      <w:r>
-        <w:rPr>
-          <w:rFonts w:ascii="Aptos Display" w:hAnsi="Aptos Display"/>
-          <w:b/>
-          <w:bCs/>
-          <w:color w:val="000000" w:themeColor="text1"/>
-        </w:rPr>
-        <w:t xml:space="preserve"> </w:t>
+        <w:t xml:space="preserve">lan </w:t>
       </w:r>
       <w:r>
         <w:rPr>
@@ -1536,16 +1545,7 @@
           <w:bCs/>
           <w:color w:val="000000" w:themeColor="text1"/>
         </w:rPr>
-        <w:t>Apr - May</w:t>
-      </w:r>
-      <w:r>
-        <w:rPr>
-          <w:rFonts w:ascii="Aptos Display" w:hAnsi="Aptos Display"/>
-          <w:b/>
-          <w:bCs/>
-          <w:color w:val="000000" w:themeColor="text1"/>
-        </w:rPr>
-        <w:t xml:space="preserve"> </w:t>
+        <w:t xml:space="preserve">Apr - May </w:t>
       </w:r>
       <w:r>
         <w:rPr>
@@ -1998,14 +1998,28 @@
           <w:rFonts w:ascii="Aptos Display" w:hAnsi="Aptos Display"/>
           <w:color w:val="000000" w:themeColor="text1"/>
         </w:rPr>
-        <w:t>CompTIA Security+ – In Progress</w:t>
-      </w:r>
-      <w:r>
-        <w:rPr>
-          <w:rFonts w:ascii="Aptos Display" w:hAnsi="Aptos Display"/>
-          <w:color w:val="000000" w:themeColor="text1"/>
-        </w:rPr>
-        <w:t xml:space="preserve"> </w:t>
+        <w:t>CompTIA Security+</w:t>
+      </w:r>
+      <w:r>
+        <w:rPr>
+          <w:rFonts w:ascii="Aptos Display" w:hAnsi="Aptos Display"/>
+          <w:color w:val="000000" w:themeColor="text1"/>
+        </w:rPr>
+        <w:t xml:space="preserve"> (</w:t>
+      </w:r>
+      <w:r>
+        <w:rPr>
+          <w:rFonts w:ascii="Aptos Display" w:hAnsi="Aptos Display"/>
+          <w:color w:val="000000" w:themeColor="text1"/>
+        </w:rPr>
+        <w:t>In Progress</w:t>
+      </w:r>
+      <w:r>
+        <w:rPr>
+          <w:rFonts w:ascii="Aptos Display" w:hAnsi="Aptos Display"/>
+          <w:color w:val="000000" w:themeColor="text1"/>
+        </w:rPr>
+        <w:t>)</w:t>
       </w:r>
       <w:r>
         <w:rPr>
@@ -2037,7 +2051,21 @@
           <w:rFonts w:ascii="Aptos Display" w:hAnsi="Aptos Display"/>
           <w:color w:val="000000" w:themeColor="text1"/>
         </w:rPr>
-        <w:t>Security Operations Center (SOC) Fundamentals – Cisco</w:t>
+        <w:t xml:space="preserve">Security Operations Center (SOC) Fundamentals </w:t>
+      </w:r>
+      <w:r>
+        <w:rPr>
+          <w:rFonts w:ascii="Aptos Display" w:hAnsi="Aptos Display"/>
+          <w:color w:val="000000" w:themeColor="text1"/>
+        </w:rPr>
+        <w:t>–</w:t>
+      </w:r>
+      <w:r>
+        <w:rPr>
+          <w:rFonts w:ascii="Aptos Display" w:hAnsi="Aptos Display"/>
+          <w:color w:val="000000" w:themeColor="text1"/>
+        </w:rPr>
+        <w:t xml:space="preserve"> Cisco</w:t>
       </w:r>
       <w:r>
         <w:rPr>

</xml_diff>

<commit_message>
Update CV and preview, tighten contact text, remove unused images, ignore Word temp files
</commit_message>
<xml_diff>
--- a/assets/cv/Zainab_Taha_CV.docx
+++ b/assets/cv/Zainab_Taha_CV.docx
@@ -652,7 +652,19 @@
         <w:rPr>
           <w:rFonts w:ascii="Aptos Display" w:hAnsi="Aptos Display"/>
         </w:rPr>
-        <w:t xml:space="preserve"> &amp; </w:t>
+        <w:t xml:space="preserve"> </w:t>
+      </w:r>
+      <w:r>
+        <w:rPr>
+          <w:rFonts w:ascii="Aptos Display" w:hAnsi="Aptos Display"/>
+        </w:rPr>
+        <w:t>or</w:t>
+      </w:r>
+      <w:r>
+        <w:rPr>
+          <w:rFonts w:ascii="Aptos Display" w:hAnsi="Aptos Display"/>
+        </w:rPr>
+        <w:t xml:space="preserve"> </w:t>
       </w:r>
       <w:r>
         <w:rPr>
@@ -719,7 +731,7 @@
         <w:rPr>
           <w:rFonts w:ascii="Aptos Display" w:hAnsi="Aptos Display"/>
         </w:rPr>
-        <w:t>&amp;</w:t>
+        <w:t>or</w:t>
       </w:r>
       <w:r>
         <w:rPr>
@@ -2444,14 +2456,14 @@
           <w:rFonts w:ascii="Aptos Display" w:hAnsi="Aptos Display" w:cs="Segoe UI"/>
           <w:shd w:val="clear" w:color="auto" w:fill="FFFFFF"/>
         </w:rPr>
-        <w:t xml:space="preserve">o-led planning and execution for </w:t>
+        <w:t>o-led planning and execution for</w:t>
       </w:r>
       <w:r>
         <w:rPr>
           <w:rFonts w:ascii="Aptos Display" w:hAnsi="Aptos Display" w:cs="Segoe UI"/>
           <w:shd w:val="clear" w:color="auto" w:fill="FFFFFF"/>
         </w:rPr>
-        <w:t xml:space="preserve">4 </w:t>
+        <w:t xml:space="preserve"> </w:t>
       </w:r>
       <w:r>
         <w:rPr>

</xml_diff>

<commit_message>
Update README and CV
</commit_message>
<xml_diff>
--- a/assets/cv/Zainab_Taha_CV.docx
+++ b/assets/cv/Zainab_Taha_CV.docx
@@ -356,21 +356,35 @@
           <w:rFonts w:ascii="Aptos Display" w:hAnsi="Aptos Display"/>
           <w:color w:val="000000" w:themeColor="text1"/>
         </w:rPr>
-        <w:t xml:space="preserve">. Seeking a cybersecurity internship starting </w:t>
-      </w:r>
-      <w:r>
-        <w:rPr>
-          <w:rFonts w:ascii="Aptos Display" w:hAnsi="Aptos Display"/>
-          <w:color w:val="000000" w:themeColor="text1"/>
-        </w:rPr>
-        <w:t>January 2027</w:t>
-      </w:r>
-      <w:r>
-        <w:rPr>
-          <w:rFonts w:ascii="Aptos Display" w:hAnsi="Aptos Display"/>
-          <w:color w:val="000000" w:themeColor="text1"/>
-        </w:rPr>
-        <w:t>.</w:t>
+        <w:t xml:space="preserve">. </w:t>
+      </w:r>
+      <w:r>
+        <w:rPr>
+          <w:rFonts w:ascii="Aptos Display" w:hAnsi="Aptos Display"/>
+          <w:color w:val="000000" w:themeColor="text1"/>
+        </w:rPr>
+        <w:t>Activly s</w:t>
+      </w:r>
+      <w:r>
+        <w:rPr>
+          <w:rFonts w:ascii="Aptos Display" w:hAnsi="Aptos Display"/>
+          <w:color w:val="000000" w:themeColor="text1"/>
+        </w:rPr>
+        <w:t xml:space="preserve">eeking cybersecurity internship </w:t>
+      </w:r>
+      <w:r>
+        <w:rPr>
+          <w:rFonts w:ascii="Aptos Display" w:hAnsi="Aptos Display"/>
+          <w:color w:val="000000" w:themeColor="text1"/>
+        </w:rPr>
+        <w:t>oppertunities</w:t>
+      </w:r>
+      <w:r>
+        <w:rPr>
+          <w:rFonts w:ascii="Aptos Display" w:hAnsi="Aptos Display"/>
+          <w:color w:val="000000" w:themeColor="text1"/>
+        </w:rPr>
+        <w:t xml:space="preserve">. </w:t>
       </w:r>
     </w:p>
     <w:p>
@@ -2045,7 +2059,14 @@
           <w:rFonts w:ascii="Aptos Display" w:hAnsi="Aptos Display"/>
           <w:color w:val="000000" w:themeColor="text1"/>
         </w:rPr>
-        <w:t>Expected Jan 2027</w:t>
+        <w:t>Ongoing</w:t>
+      </w:r>
+      <w:r>
+        <w:rPr>
+          <w:rFonts w:ascii="Aptos Display" w:hAnsi="Aptos Display"/>
+          <w:color w:val="000000" w:themeColor="text1"/>
+        </w:rPr>
+        <w:t xml:space="preserve"> Jan 2027</w:t>
       </w:r>
     </w:p>
     <w:p>
@@ -2274,7 +2295,25 @@
           <w:bCs/>
           <w:color w:val="000000" w:themeColor="text1"/>
         </w:rPr>
-        <w:t>Nominee, Student Shura Council President – Effat University</w:t>
+        <w:t>Vice President, Society of Petroleum Engineer</w:t>
+      </w:r>
+      <w:r>
+        <w:rPr>
+          <w:rFonts w:ascii="Aptos Display" w:hAnsi="Aptos Display"/>
+          <w:b/>
+          <w:bCs/>
+          <w:color w:val="000000" w:themeColor="text1"/>
+        </w:rPr>
+        <w:t>s</w:t>
+      </w:r>
+      <w:r>
+        <w:rPr>
+          <w:rFonts w:ascii="Aptos Display" w:hAnsi="Aptos Display"/>
+          <w:b/>
+          <w:bCs/>
+          <w:color w:val="000000" w:themeColor="text1"/>
+        </w:rPr>
+        <w:t xml:space="preserve"> (SPE) – SPE Chapter, Effat University</w:t>
       </w:r>
       <w:r>
         <w:rPr>
@@ -2299,7 +2338,25 @@
           <w:bCs/>
           <w:color w:val="000000" w:themeColor="text1"/>
         </w:rPr>
-        <w:t>2026</w:t>
+        <w:t>202</w:t>
+      </w:r>
+      <w:r>
+        <w:rPr>
+          <w:rFonts w:ascii="Aptos Display" w:hAnsi="Aptos Display"/>
+          <w:b/>
+          <w:bCs/>
+          <w:color w:val="000000" w:themeColor="text1"/>
+        </w:rPr>
+        <w:t>6</w:t>
+      </w:r>
+      <w:r>
+        <w:rPr>
+          <w:rFonts w:ascii="Aptos Display" w:hAnsi="Aptos Display"/>
+          <w:b/>
+          <w:bCs/>
+          <w:color w:val="000000" w:themeColor="text1"/>
+        </w:rPr>
+        <w:t>-Present</w:t>
       </w:r>
     </w:p>
     <w:p>
@@ -2317,10 +2374,34 @@
       </w:pPr>
       <w:r>
         <w:rPr>
-          <w:rFonts w:ascii="Aptos Display" w:hAnsi="Aptos Display"/>
-          <w:color w:val="000000" w:themeColor="text1"/>
-        </w:rPr>
-        <w:t>Nominated for Queen Effat Citizenship Award to serve as Student Shura President and student-body representative.</w:t>
+          <w:rFonts w:ascii="Aptos Display" w:hAnsi="Aptos Display" w:cs="Segoe UI"/>
+          <w:shd w:val="clear" w:color="auto" w:fill="FFFFFF"/>
+        </w:rPr>
+        <w:t xml:space="preserve">Co-founded and </w:t>
+      </w:r>
+      <w:r>
+        <w:rPr>
+          <w:rFonts w:ascii="Aptos Display" w:hAnsi="Aptos Display"/>
+        </w:rPr>
+        <w:t>c</w:t>
+      </w:r>
+      <w:r>
+        <w:rPr>
+          <w:rFonts w:ascii="Aptos Display" w:hAnsi="Aptos Display"/>
+        </w:rPr>
+        <w:t>o-direct</w:t>
+      </w:r>
+      <w:r>
+        <w:rPr>
+          <w:rFonts w:ascii="Aptos Display" w:hAnsi="Aptos Display"/>
+        </w:rPr>
+        <w:t>ed</w:t>
+      </w:r>
+      <w:r>
+        <w:rPr>
+          <w:rFonts w:ascii="Aptos Display" w:hAnsi="Aptos Display"/>
+        </w:rPr>
+        <w:t xml:space="preserve"> strategic planning and operational execution for technical workshops and community initiatives.</w:t>
       </w:r>
     </w:p>
     <w:p>
@@ -2497,25 +2578,7 @@
           <w:bCs/>
           <w:color w:val="000000" w:themeColor="text1"/>
         </w:rPr>
-        <w:t>Vice President, Society of Petroleum Engineer</w:t>
-      </w:r>
-      <w:r>
-        <w:rPr>
-          <w:rFonts w:ascii="Aptos Display" w:hAnsi="Aptos Display"/>
-          <w:b/>
-          <w:bCs/>
-          <w:color w:val="000000" w:themeColor="text1"/>
-        </w:rPr>
-        <w:t>s</w:t>
-      </w:r>
-      <w:r>
-        <w:rPr>
-          <w:rFonts w:ascii="Aptos Display" w:hAnsi="Aptos Display"/>
-          <w:b/>
-          <w:bCs/>
-          <w:color w:val="000000" w:themeColor="text1"/>
-        </w:rPr>
-        <w:t xml:space="preserve"> (SPE) – SPE Chapter, Effat University</w:t>
+        <w:t>Nominee, Student Shura Council President – Effat University</w:t>
       </w:r>
       <w:r>
         <w:rPr>
@@ -2540,25 +2603,7 @@
           <w:bCs/>
           <w:color w:val="000000" w:themeColor="text1"/>
         </w:rPr>
-        <w:t>202</w:t>
-      </w:r>
-      <w:r>
-        <w:rPr>
-          <w:rFonts w:ascii="Aptos Display" w:hAnsi="Aptos Display"/>
-          <w:b/>
-          <w:bCs/>
-          <w:color w:val="000000" w:themeColor="text1"/>
-        </w:rPr>
-        <w:t>6</w:t>
-      </w:r>
-      <w:r>
-        <w:rPr>
-          <w:rFonts w:ascii="Aptos Display" w:hAnsi="Aptos Display"/>
-          <w:b/>
-          <w:bCs/>
-          <w:color w:val="000000" w:themeColor="text1"/>
-        </w:rPr>
-        <w:t>-Present</w:t>
+        <w:t>2026</w:t>
       </w:r>
     </w:p>
     <w:p>
@@ -2576,40 +2621,10 @@
       </w:pPr>
       <w:r>
         <w:rPr>
-          <w:rFonts w:ascii="Aptos Display" w:hAnsi="Aptos Display" w:cs="Segoe UI"/>
-          <w:shd w:val="clear" w:color="auto" w:fill="FFFFFF"/>
-        </w:rPr>
-        <w:t xml:space="preserve">Co-founded and </w:t>
-      </w:r>
-      <w:r>
-        <w:rPr>
-          <w:rFonts w:ascii="Aptos Display" w:hAnsi="Aptos Display"/>
-        </w:rPr>
-        <w:t>c</w:t>
-      </w:r>
-      <w:r>
-        <w:rPr>
-          <w:rFonts w:ascii="Aptos Display" w:hAnsi="Aptos Display"/>
-        </w:rPr>
-        <w:t>o-direct</w:t>
-      </w:r>
-      <w:r>
-        <w:rPr>
-          <w:rFonts w:ascii="Aptos Display" w:hAnsi="Aptos Display"/>
-        </w:rPr>
-        <w:t>ed</w:t>
-      </w:r>
-      <w:r>
-        <w:rPr>
-          <w:rFonts w:ascii="Aptos Display" w:hAnsi="Aptos Display"/>
-        </w:rPr>
-        <w:t xml:space="preserve"> strategic planning and operational execution for technical workshops and community initiatives</w:t>
-      </w:r>
-      <w:r>
-        <w:rPr>
-          <w:rFonts w:ascii="Aptos Display" w:hAnsi="Aptos Display"/>
-        </w:rPr>
-        <w:t>.</w:t>
+          <w:rFonts w:ascii="Aptos Display" w:hAnsi="Aptos Display"/>
+          <w:color w:val="000000" w:themeColor="text1"/>
+        </w:rPr>
+        <w:t>Nominated for Queen Effat Citizenship Award to serve as Student Shura President and student-body representative.</w:t>
       </w:r>
     </w:p>
     <w:sectPr>

</xml_diff>